<commit_message>
Restore revised electricity and magnetism exam booklets and downloads
</commit_message>
<xml_diff>
--- a/electricity-magnetism-revision/electricity-magnetism-practice-answers.docx
+++ b/electricity-magnetism-revision/electricity-magnetism-practice-answers.docx
@@ -39,10 +39,13 @@
         <w:rPr>
           <w:b/>
         </w:rPr>
-        <w:t xml:space="preserve">(a)  </w:t>
+        <w:t>(a)</w:t>
       </w:r>
       <w:r>
-        <w:t>Electrons move from the wool cloth to the plastic rod (1); the cloth is left positively charged (1). [2]</w:t>
+        <w:rPr>
+          <w:b w:val="0"/>
+        </w:rPr>
+        <w:t xml:space="preserve">  Electrons move from the wool cloth to the plastic rod (1); the cloth is left positively charged (1). [2]</w:t>
       </w:r>
     </w:p>
     <w:p>
@@ -53,10 +56,13 @@
         <w:rPr>
           <w:b/>
         </w:rPr>
-        <w:t xml:space="preserve">(b)  </w:t>
+        <w:t>(b)</w:t>
       </w:r>
       <w:r>
-        <w:t>The negative rod repels electrons in the near side of the neutral paper (1); the near side becomes relatively positive while the far side becomes relatively negative (1); the attraction between opposite charges at the nearer side is stronger than the repulsion at the farther side, giving a net attraction (1). [3]</w:t>
+        <w:rPr>
+          <w:b w:val="0"/>
+        </w:rPr>
+        <w:t xml:space="preserve">  The negative rod repels electrons in the near side of the neutral paper (1); the near side becomes relatively positive while the far side becomes relatively negative (1); the attraction between opposite charges at the nearer side is stronger than the repulsion at the farther side, giving a net attraction (1). [3]</w:t>
       </w:r>
     </w:p>
     <w:p>
@@ -67,10 +73,13 @@
         <w:rPr>
           <w:b/>
         </w:rPr>
-        <w:t xml:space="preserve">(c)  </w:t>
+        <w:t>(c)</w:t>
       </w:r>
       <w:r>
-        <w:t>Charge separation occurs in the cloud (1); the charged cloud induces opposite charge at the ground or creates a large potential difference (1); when the electric field is strong enough the air ionises and charge flows through the conducting path as a discharge (1). [3]</w:t>
+        <w:rPr>
+          <w:b w:val="0"/>
+        </w:rPr>
+        <w:t xml:space="preserve">  Charge separation occurs in the cloud (1); the charged cloud induces opposite charge at the ground or creates a large potential difference (1); when the electric field is strong enough the air ionises and charge flows through the conducting path as a discharge (1). [3]</w:t>
       </w:r>
     </w:p>
     <w:p>
@@ -89,10 +98,13 @@
         <w:rPr>
           <w:b/>
         </w:rPr>
-        <w:t xml:space="preserve">(a)  </w:t>
+        <w:t>(a)</w:t>
       </w:r>
       <w:r>
-        <w:t>X is an ammeter (1), placed in series so the same current passes through it and the lamp (1). Y is a voltmeter (1), connected in parallel across the lamp to measure its potential difference (1). [4]</w:t>
+        <w:rPr>
+          <w:b w:val="0"/>
+        </w:rPr>
+        <w:t xml:space="preserve">  X is an ammeter (1), placed in series so the same current passes through it and the lamp (1). Y is a voltmeter (1), connected in parallel across the lamp to measure its potential difference (1). [4]</w:t>
       </w:r>
     </w:p>
     <w:p>
@@ -103,10 +115,13 @@
         <w:rPr>
           <w:b/>
         </w:rPr>
-        <w:t xml:space="preserve">(b)  </w:t>
+        <w:t>(b)</w:t>
       </w:r>
       <w:r>
-        <w:t>R = V ÷ I (1) = 9 ÷ 0.30 (1) = 30 Ω (1). [3]</w:t>
+        <w:rPr>
+          <w:b w:val="0"/>
+        </w:rPr>
+        <w:t xml:space="preserve">  R = V ÷ I (1) = 9 ÷ 0.30 (1) = 30 Ω (1). [3]</w:t>
       </w:r>
     </w:p>
     <w:p>
@@ -117,10 +132,13 @@
         <w:rPr>
           <w:b/>
         </w:rPr>
-        <w:t xml:space="preserve">(c)  </w:t>
+        <w:t>(c)</w:t>
       </w:r>
       <w:r>
-        <w:t>P = VI (1) = 9 × 0.30 = 2.7 W (1). [2]</w:t>
+        <w:rPr>
+          <w:b w:val="0"/>
+        </w:rPr>
+        <w:t xml:space="preserve">  P = VI (1) = 9 × 0.30 = 2.7 W (1). [2]</w:t>
       </w:r>
     </w:p>
     <w:p>
@@ -131,10 +149,13 @@
         <w:rPr>
           <w:b/>
         </w:rPr>
-        <w:t xml:space="preserve">(d)  </w:t>
+        <w:t>(d)</w:t>
       </w:r>
       <w:r>
-        <w:t>Each coulomb transfers 9 J of energy in the lamp. [1]</w:t>
+        <w:rPr>
+          <w:b w:val="0"/>
+        </w:rPr>
+        <w:t xml:space="preserve">  Watt or watts or W. [1]</w:t>
       </w:r>
     </w:p>
     <w:p>
@@ -153,10 +174,13 @@
         <w:rPr>
           <w:b/>
         </w:rPr>
-        <w:t xml:space="preserve">(a)  </w:t>
+        <w:t>(a)</w:t>
       </w:r>
       <w:r>
-        <w:t>Rtotal = R A + R B (1) = 4 + 8 = 12 Ω (1). [2]</w:t>
+        <w:rPr>
+          <w:b w:val="0"/>
+        </w:rPr>
+        <w:t xml:space="preserve">  Rtotal = R A + R B (1) = 4 + 8 = 12 Ω (1). [2]</w:t>
       </w:r>
     </w:p>
     <w:p>
@@ -167,10 +191,13 @@
         <w:rPr>
           <w:b/>
         </w:rPr>
-        <w:t xml:space="preserve">(b)  </w:t>
+        <w:t>(b)</w:t>
       </w:r>
       <w:r>
-        <w:t>I = V ÷ Rtotal (1) = 12 ÷ 12 = 1.0 A through A and B (1). [2]</w:t>
+        <w:rPr>
+          <w:b w:val="0"/>
+        </w:rPr>
+        <w:t xml:space="preserve">  I = V ÷ Rtotal (1) = 12 ÷ 12 = 1.0 A through A and B (1). [2]</w:t>
       </w:r>
     </w:p>
     <w:p>
@@ -181,10 +208,13 @@
         <w:rPr>
           <w:b/>
         </w:rPr>
-        <w:t xml:space="preserve">(c)  </w:t>
+        <w:t>(c)</w:t>
       </w:r>
       <w:r>
-        <w:t>V B = I × R B (1) = 1.0 × 8 = 8 V (1). [2]</w:t>
+        <w:rPr>
+          <w:b w:val="0"/>
+        </w:rPr>
+        <w:t xml:space="preserve">  V B = I × R B (1) = 1.0 × 8 = 8 V (1). [2]</w:t>
       </w:r>
     </w:p>
     <w:p>
@@ -195,10 +225,13 @@
         <w:rPr>
           <w:b/>
         </w:rPr>
-        <w:t xml:space="preserve">(d)  </w:t>
+        <w:t>(d)</w:t>
       </w:r>
       <w:r>
-        <w:t>V A = 4 V, from IR or 12 − 8. [1]</w:t>
+        <w:rPr>
+          <w:b w:val="0"/>
+        </w:rPr>
+        <w:t xml:space="preserve">  V A = 4 V, from IR or 12 − 8. [1]</w:t>
       </w:r>
     </w:p>
     <w:p>
@@ -209,10 +242,13 @@
         <w:rPr>
           <w:b/>
         </w:rPr>
-        <w:t xml:space="preserve">(e)  </w:t>
+        <w:t>(e)</w:t>
       </w:r>
       <w:r>
-        <w:t>Total resistance increases (1), so current in the series circuit decreases (1), and the original lamps become dimmer because each transfers less power (1). [3]</w:t>
+        <w:rPr>
+          <w:b w:val="0"/>
+        </w:rPr>
+        <w:t xml:space="preserve">  Total resistance increases (1), so current in the series circuit decreases (1), and the original lamps become dimmer because each transfers less power (1). [3]</w:t>
       </w:r>
     </w:p>
     <w:p>
@@ -231,10 +267,13 @@
         <w:rPr>
           <w:b/>
         </w:rPr>
-        <w:t xml:space="preserve">(a)  </w:t>
+        <w:t>(a)</w:t>
       </w:r>
       <w:r>
-        <w:t>A has 6 V (1) and B has 6 V (1); each branch is across the battery. [2]</w:t>
+        <w:rPr>
+          <w:b w:val="0"/>
+        </w:rPr>
+        <w:t xml:space="preserve">  A has 6 V (1) and B has 6 V (1); each branch is across the battery. [2]</w:t>
       </w:r>
     </w:p>
     <w:p>
@@ -245,10 +284,13 @@
         <w:rPr>
           <w:b/>
         </w:rPr>
-        <w:t xml:space="preserve">(b)  </w:t>
+        <w:t>(b)</w:t>
       </w:r>
       <w:r>
-        <w:t>I A = V ÷ R A (1) = 6 ÷ 6 = 1 A (1). [2]</w:t>
+        <w:rPr>
+          <w:b w:val="0"/>
+        </w:rPr>
+        <w:t xml:space="preserve">  I A = V ÷ R A (1) = 6 ÷ 6 = 1 A (1). [2]</w:t>
       </w:r>
     </w:p>
     <w:p>
@@ -259,10 +301,13 @@
         <w:rPr>
           <w:b/>
         </w:rPr>
-        <w:t xml:space="preserve">(c)  </w:t>
+        <w:t>(c)</w:t>
       </w:r>
       <w:r>
-        <w:t>I B = V ÷ R B (1) = 6 ÷ 3 = 2 A (1). [2]</w:t>
+        <w:rPr>
+          <w:b w:val="0"/>
+        </w:rPr>
+        <w:t xml:space="preserve">  I B = V ÷ R B (1) = 6 ÷ 3 = 2 A (1). [2]</w:t>
       </w:r>
     </w:p>
     <w:p>
@@ -273,10 +318,13 @@
         <w:rPr>
           <w:b/>
         </w:rPr>
-        <w:t xml:space="preserve">(d)  </w:t>
+        <w:t>(d)</w:t>
       </w:r>
       <w:r>
-        <w:t>Itotal = 1 + 2 = 3 A. [1]</w:t>
+        <w:rPr>
+          <w:b w:val="0"/>
+        </w:rPr>
+        <w:t xml:space="preserve">  Itotal = 1 + 2 = 3 A. [1]</w:t>
       </w:r>
     </w:p>
     <w:p>
@@ -287,10 +335,13 @@
         <w:rPr>
           <w:b/>
         </w:rPr>
-        <w:t xml:space="preserve">(e)  </w:t>
+        <w:t>(e)</w:t>
       </w:r>
       <w:r>
-        <w:t>P B = VI (1) = 6 × 2 = 12 W (1). Accept V²/R. [2]</w:t>
+        <w:rPr>
+          <w:b w:val="0"/>
+        </w:rPr>
+        <w:t xml:space="preserve">  P B = VI (1) = 6 × 2 = 12 W (1). Accept V²/R. [2]</w:t>
       </w:r>
     </w:p>
     <w:p>
@@ -301,10 +352,13 @@
         <w:rPr>
           <w:b/>
         </w:rPr>
-        <w:t xml:space="preserve">(f)  </w:t>
+        <w:t>(f)</w:t>
       </w:r>
       <w:r>
-        <w:t>The B branch is open, so only A draws current: 1 A. [1]</w:t>
+        <w:rPr>
+          <w:b w:val="0"/>
+        </w:rPr>
+        <w:t xml:space="preserve">  The B branch is open, so only A draws current: 1 A. [1]</w:t>
       </w:r>
     </w:p>
     <w:p>
@@ -312,7 +366,7 @@
         <w:pStyle w:val="Heading1"/>
       </w:pPr>
       <w:r>
-        <w:t>Question 5  A mixed circuit   [10 marks]</w:t>
+        <w:t>Question 5  Magnetic field calculations   [10 marks]</w:t>
       </w:r>
     </w:p>
     <w:p>
@@ -323,10 +377,13 @@
         <w:rPr>
           <w:b/>
         </w:rPr>
-        <w:t xml:space="preserve">(a)  </w:t>
+        <w:t>(a)</w:t>
       </w:r>
       <w:r>
-        <w:t>Vseries = IR (1) = 2.0 × 2 = 4 V (1). [2]</w:t>
+        <w:rPr>
+          <w:b w:val="0"/>
+        </w:rPr>
+        <w:t xml:space="preserve">  d = 5.0 cm = 0.050 m (1). B = (2.0 × 10⁻⁷ × 4.0) ÷ 0.050 (1). B = 1.6 × 10⁻⁵ T (1). Accept 16 μT. [3]</w:t>
       </w:r>
     </w:p>
     <w:p>
@@ -337,10 +394,13 @@
         <w:rPr>
           <w:b/>
         </w:rPr>
-        <w:t xml:space="preserve">(b)  </w:t>
+        <w:t>(b)</w:t>
       </w:r>
       <w:r>
-        <w:t>Vparallel = 12 − 4 (1) = 8 V (1). [2]</w:t>
+        <w:rPr>
+          <w:b w:val="0"/>
+        </w:rPr>
+        <w:t xml:space="preserve">  I = (3.0 × 10⁻⁵ × 0.020) ÷ (2.0 × 10⁻⁷) (1). I = 3.0 A (1). [2]</w:t>
       </w:r>
     </w:p>
     <w:p>
@@ -351,10 +411,13 @@
         <w:rPr>
           <w:b/>
         </w:rPr>
-        <w:t xml:space="preserve">(c)  </w:t>
+        <w:t>(c)</w:t>
       </w:r>
       <w:r>
-        <w:t>Ibranch = Vparallel ÷ Rbranch (1) = 8 ÷ 8 = 1 A in each branch (1). [2]</w:t>
+        <w:rPr>
+          <w:b w:val="0"/>
+        </w:rPr>
+        <w:t xml:space="preserve">  d = (2.0 × 10⁻⁷ × 5.0) ÷ (2.0 × 10⁻⁵) (1). d = 0.050 m (1). Accept 5.0 cm. [2]</w:t>
       </w:r>
     </w:p>
     <w:p>
@@ -365,10 +428,13 @@
         <w:rPr>
           <w:b/>
         </w:rPr>
-        <w:t xml:space="preserve">(d)  </w:t>
+        <w:t>(d)</w:t>
       </w:r>
       <w:r>
-        <w:t>At the junction 1 + 1 = 2 A (1). Around either complete loop 4 + 8 = 12 V (1). [2]</w:t>
+        <w:rPr>
+          <w:b w:val="0"/>
+        </w:rPr>
+        <w:t xml:space="preserve">  Doubling current with distance fixed doubles B (1). Doubling distance with current fixed halves B (1). [2]</w:t>
       </w:r>
     </w:p>
     <w:p>
@@ -379,10 +445,13 @@
         <w:rPr>
           <w:b/>
         </w:rPr>
-        <w:t xml:space="preserve">(e)  </w:t>
+        <w:t>(e)</w:t>
       </w:r>
       <w:r>
-        <w:t>New total R = 2 + 8 = 10 Ω (1); I = 12 ÷ 10 = 1.2 A (1). [2]</w:t>
+        <w:rPr>
+          <w:b w:val="0"/>
+        </w:rPr>
+        <w:t xml:space="preserve">  Tesla or teslas or T. [1]</w:t>
       </w:r>
     </w:p>
     <w:p>
@@ -401,10 +470,13 @@
         <w:rPr>
           <w:b/>
         </w:rPr>
-        <w:t xml:space="preserve">(a)  </w:t>
+        <w:t>(a)</w:t>
       </w:r>
       <w:r>
-        <w:t>The end nearest the bar magnet’s S pole becomes N (1). Opposite poles attract (1). [2]</w:t>
+        <w:rPr>
+          <w:b w:val="0"/>
+        </w:rPr>
+        <w:t xml:space="preserve">  The end nearest the bar magnet’s S pole becomes N (1). Opposite poles attract (1). [2]</w:t>
       </w:r>
     </w:p>
     <w:p>
@@ -415,10 +487,13 @@
         <w:rPr>
           <w:b/>
         </w:rPr>
-        <w:t xml:space="preserve">(b)  </w:t>
+        <w:t>(b)</w:t>
       </w:r>
       <w:r>
-        <w:t>Award 1 for two curved external field lines emerging from N and entering S; 1 for arrows N → S. Do not award a straight line through the magnet as an external field line. [2]</w:t>
+        <w:rPr>
+          <w:b w:val="0"/>
+        </w:rPr>
+        <w:t xml:space="preserve">  Award 1 for two curved external field lines emerging from N and entering S; 1 for arrows N → S. Do not award a straight line through the magnet as an external field line. [2]</w:t>
       </w:r>
     </w:p>
     <w:p>
@@ -429,10 +504,13 @@
         <w:rPr>
           <w:b/>
         </w:rPr>
-        <w:t xml:space="preserve">(c)  </w:t>
+        <w:t>(c)</w:t>
       </w:r>
       <w:r>
-        <w:t>One approximately circular field line centred on the dot, with an anticlockwise arrow. [1]</w:t>
+        <w:rPr>
+          <w:b w:val="0"/>
+        </w:rPr>
+        <w:t xml:space="preserve">  Concentric circles centred on the wire. Accept circular field lines around the wire. No direction arrow is required. [1]</w:t>
       </w:r>
     </w:p>
     <w:p>
@@ -443,49 +521,13 @@
         <w:rPr>
           <w:b/>
         </w:rPr>
-        <w:t xml:space="preserve">(d)  </w:t>
+        <w:t>(d)</w:t>
       </w:r>
       <w:r>
-        <w:t>North pole. [1]</w:t>
-      </w:r>
-    </w:p>
-    <w:p>
-      <w:pPr>
-        <w:jc w:val="center"/>
-      </w:pPr>
-      <w:r>
-        <w:drawing>
-          <wp:inline xmlns:a="http://schemas.openxmlformats.org/drawingml/2006/main" xmlns:pic="http://schemas.openxmlformats.org/drawingml/2006/picture">
-            <wp:extent cx="5112000" cy="1736151"/>
-            <wp:docPr id="1" name="Picture 1"/>
-            <wp:cNvGraphicFramePr>
-              <a:graphicFrameLocks noChangeAspect="1"/>
-            </wp:cNvGraphicFramePr>
-            <a:graphic>
-              <a:graphicData uri="http://schemas.openxmlformats.org/drawingml/2006/picture">
-                <pic:pic>
-                  <pic:nvPicPr>
-                    <pic:cNvPr id="0" name="magnet_answer.png"/>
-                    <pic:cNvPicPr/>
-                  </pic:nvPicPr>
-                  <pic:blipFill>
-                    <a:blip r:embed="rId10"/>
-                    <a:stretch>
-                      <a:fillRect/>
-                    </a:stretch>
-                  </pic:blipFill>
-                  <pic:spPr>
-                    <a:xfrm>
-                      <a:off x="0" y="0"/>
-                      <a:ext cx="5112000" cy="1736151"/>
-                    </a:xfrm>
-                    <a:prstGeom prst="rect"/>
-                  </pic:spPr>
-                </pic:pic>
-              </a:graphicData>
-            </a:graphic>
-          </wp:inline>
-        </w:drawing>
+        <w:rPr>
+          <w:b w:val="0"/>
+        </w:rPr>
+        <w:t xml:space="preserve">  Any one: straight lines, parallel lines, or equally spaced lines inside the long solenoid. [1]</w:t>
       </w:r>
     </w:p>
     <w:p>

</xml_diff>